<commit_message>
style: Resume accordion light theme + spacing + skill pills fix
</commit_message>
<xml_diff>
--- a/Unit 6 Learning Diary.docx
+++ b/Unit 6 Learning Diary.docx
@@ -2,7 +2,285 @@
 <file path=word/document.xml><?xml version="1.0" encoding="utf-8"?>
 <w:document xmlns:wpc="http://schemas.microsoft.com/office/word/2010/wordprocessingCanvas" xmlns:cx="http://schemas.microsoft.com/office/drawing/2014/chartex" xmlns:cx1="http://schemas.microsoft.com/office/drawing/2015/9/8/chartex" xmlns:cx2="http://schemas.microsoft.com/office/drawing/2015/10/21/chartex" xmlns:cx3="http://schemas.microsoft.com/office/drawing/2016/5/9/chartex" xmlns:cx4="http://schemas.microsoft.com/office/drawing/2016/5/10/chartex" xmlns:cx5="http://schemas.microsoft.com/office/drawing/2016/5/11/chartex" xmlns:cx6="http://schemas.microsoft.com/office/drawing/2016/5/12/chartex" xmlns:cx7="http://schemas.microsoft.com/office/drawing/2016/5/13/chartex" xmlns:cx8="http://schemas.microsoft.com/office/drawing/2016/5/14/chartex" xmlns:mc="http://schemas.openxmlformats.org/markup-compatibility/2006" xmlns:aink="http://schemas.microsoft.com/office/drawing/2016/ink" xmlns:am3d="http://schemas.microsoft.com/office/drawing/2017/model3d" xmlns:o="urn:schemas-microsoft-com:office:office" xmlns:oel="http://schemas.microsoft.com/office/2019/extlst" xmlns:r="http://schemas.openxmlformats.org/officeDocument/2006/relationships" xmlns:m="http://schemas.openxmlformats.org/officeDocument/2006/math" xmlns:v="urn:schemas-microsoft-com:vml" xmlns:wp14="http://schemas.microsoft.com/office/word/2010/wordprocessingDrawing" xmlns:wp="http://schemas.openxmlformats.org/drawingml/2006/wordprocessingDrawing" xmlns:w10="urn:schemas-microsoft-com:office:word" xmlns:w="http://schemas.openxmlformats.org/wordprocessingml/2006/main" xmlns:w14="http://schemas.microsoft.com/office/word/2010/wordml" xmlns:w15="http://schemas.microsoft.com/office/word/2012/wordml" xmlns:w16cex="http://schemas.microsoft.com/office/word/2018/wordml/cex" xmlns:w16cid="http://schemas.microsoft.com/office/word/2016/wordml/cid" xmlns:w16="http://schemas.microsoft.com/office/word/2018/wordml" xmlns:w16du="http://schemas.microsoft.com/office/word/2023/wordml/word16du" xmlns:w16sdtdh="http://schemas.microsoft.com/office/word/2020/wordml/sdtdatahash" xmlns:w16sdtfl="http://schemas.microsoft.com/office/word/2024/wordml/sdtformatlock" xmlns:w16se="http://schemas.microsoft.com/office/word/2015/wordml/symex" xmlns:wpg="http://schemas.microsoft.com/office/word/2010/wordprocessingGroup" xmlns:wpi="http://schemas.microsoft.com/office/word/2010/wordprocessingInk" xmlns:wne="http://schemas.microsoft.com/office/word/2006/wordml" xmlns:wps="http://schemas.microsoft.com/office/word/2010/wordprocessingShape" mc:Ignorable="w14 w15 w16se w16cid w16 w16cex w16sdtdh w16sdtfl w16du wp14">
   <w:body>
+    <w:p>
+      <w:r>
+        <w:t xml:space="preserve"># Unit 6 – Learning Diary : jQuery </w:t>
+      </w:r>
+      <w:proofErr w:type="spellStart"/>
+      <w:r>
+        <w:t>Implementation</w:t>
+      </w:r>
+      <w:proofErr w:type="spellEnd"/>
+    </w:p>
+    <w:p>
+      <w:r>
+        <w:t xml:space="preserve"># Comp 266 – Introduction to web </w:t>
+      </w:r>
+      <w:proofErr w:type="spellStart"/>
+      <w:r>
+        <w:t>programming</w:t>
+      </w:r>
+      <w:proofErr w:type="spellEnd"/>
+    </w:p>
+    <w:p>
+      <w:r>
+        <w:t># Student ID : 3747897</w:t>
+      </w:r>
+    </w:p>
+    <w:p>
+      <w:r>
+        <w:t>Kossi Aholou</w:t>
+      </w:r>
+    </w:p>
+    <w:p>
+      <w:r>
+        <w:t>June 2026</w:t>
+      </w:r>
+    </w:p>
     <w:p/>
+    <w:p>
+      <w:pPr>
+        <w:pStyle w:val="Paragraphedeliste"/>
+        <w:numPr>
+          <w:ilvl w:val="0"/>
+          <w:numId w:val="1"/>
+        </w:numPr>
+        <w:rPr>
+          <w:lang w:val="en-CA"/>
+        </w:rPr>
+      </w:pPr>
+      <w:r>
+        <w:rPr>
+          <w:lang w:val="en-CA"/>
+        </w:rPr>
+        <w:t>What this unit asked me t</w:t>
+      </w:r>
+      <w:r>
+        <w:rPr>
+          <w:lang w:val="en-CA"/>
+        </w:rPr>
+        <w:t>o do</w:t>
+      </w:r>
+    </w:p>
+    <w:p>
+      <w:pPr>
+        <w:rPr>
+          <w:lang w:val="en-CA"/>
+        </w:rPr>
+      </w:pPr>
+      <w:r>
+        <w:rPr>
+          <w:lang w:val="en-CA"/>
+        </w:rPr>
+        <w:t xml:space="preserve">Unit 6 required me to extend my portfolio website with jQuery-powered interactivity. Based on the proposal I submitted and received feedback on, I implemented seven features using jQuery 3.7.1 and jQuery UI 1.13.3 both libraries are stored as local copies in a “scripts” </w:t>
+      </w:r>
+      <w:r>
+        <w:rPr>
+          <w:lang w:val="en-CA"/>
+        </w:rPr>
+        <w:t>folder rather than loaded from a CDN, which means the site works offline and does not depend on a third-party server.</w:t>
+      </w:r>
+    </w:p>
+    <w:p>
+      <w:pPr>
+        <w:rPr>
+          <w:lang w:val="en-CA"/>
+        </w:rPr>
+      </w:pPr>
+      <w:r>
+        <w:rPr>
+          <w:lang w:val="en-CA"/>
+        </w:rPr>
+        <w:t>The seven features are:</w:t>
+      </w:r>
+    </w:p>
+    <w:p>
+      <w:pPr>
+        <w:pStyle w:val="Paragraphedeliste"/>
+        <w:rPr>
+          <w:lang w:val="en-CA"/>
+        </w:rPr>
+      </w:pPr>
+      <w:r>
+        <w:rPr>
+          <w:lang w:val="en-CA"/>
+        </w:rPr>
+        <w:t>a- Sticky Navigation Bar</w:t>
+      </w:r>
+    </w:p>
+    <w:p>
+      <w:pPr>
+        <w:pStyle w:val="Paragraphedeliste"/>
+        <w:rPr>
+          <w:lang w:val="en-CA"/>
+        </w:rPr>
+      </w:pPr>
+      <w:r>
+        <w:rPr>
+          <w:lang w:val="en-CA"/>
+        </w:rPr>
+        <w:t>b- Animated Statistics counter</w:t>
+      </w:r>
+    </w:p>
+    <w:p>
+      <w:pPr>
+        <w:pStyle w:val="Paragraphedeliste"/>
+        <w:rPr>
+          <w:lang w:val="en-CA"/>
+        </w:rPr>
+      </w:pPr>
+      <w:r>
+        <w:rPr>
+          <w:lang w:val="en-CA"/>
+        </w:rPr>
+        <w:t>c- smooth scroll</w:t>
+      </w:r>
+    </w:p>
+    <w:p>
+      <w:pPr>
+        <w:pStyle w:val="Paragraphedeliste"/>
+        <w:rPr>
+          <w:lang w:val="en-CA"/>
+        </w:rPr>
+      </w:pPr>
+      <w:r>
+        <w:rPr>
+          <w:lang w:val="en-CA"/>
+        </w:rPr>
+        <w:t>d- Back-to-Top button</w:t>
+      </w:r>
+    </w:p>
+    <w:p>
+      <w:pPr>
+        <w:pStyle w:val="Paragraphedeliste"/>
+        <w:rPr>
+          <w:lang w:val="en-CA"/>
+        </w:rPr>
+      </w:pPr>
+      <w:r>
+        <w:rPr>
+          <w:lang w:val="en-CA"/>
+        </w:rPr>
+        <w:t>e- Resume accordion (jQuery UI)</w:t>
+      </w:r>
+    </w:p>
+    <w:p>
+      <w:pPr>
+        <w:pStyle w:val="Paragraphedeliste"/>
+        <w:rPr>
+          <w:lang w:val="en-CA"/>
+        </w:rPr>
+      </w:pPr>
+      <w:r>
+        <w:rPr>
+          <w:lang w:val="en-CA"/>
+        </w:rPr>
+        <w:t>f- Fade-in sections on scroll</w:t>
+      </w:r>
+    </w:p>
+    <w:p>
+      <w:pPr>
+        <w:pStyle w:val="Paragraphedeliste"/>
+        <w:rPr>
+          <w:lang w:val="en-CA"/>
+        </w:rPr>
+      </w:pPr>
+      <w:r>
+        <w:rPr>
+          <w:lang w:val="en-CA"/>
+        </w:rPr>
+        <w:t>g- Tooltips on skill items (jQuery UI)</w:t>
+      </w:r>
+    </w:p>
+    <w:p>
+      <w:pPr>
+        <w:rPr>
+          <w:lang w:val="en-CA"/>
+        </w:rPr>
+      </w:pPr>
+      <w:r>
+        <w:rPr>
+          <w:lang w:val="en-CA"/>
+        </w:rPr>
+        <w:t xml:space="preserve">the features a, c, d and f are shared across all six pages and live in a single file: </w:t>
+      </w:r>
+      <w:r>
+        <w:rPr>
+          <w:b/>
+          <w:bCs/>
+          <w:lang w:val="en-CA"/>
+        </w:rPr>
+        <w:t>scripts/main.js</w:t>
+      </w:r>
+      <w:r>
+        <w:rPr>
+          <w:b/>
+          <w:bCs/>
+          <w:lang w:val="en-CA"/>
+        </w:rPr>
+        <w:t xml:space="preserve">. </w:t>
+      </w:r>
+      <w:r>
+        <w:rPr>
+          <w:lang w:val="en-CA"/>
+        </w:rPr>
+        <w:t>Feature b, e and g are page-specific and are written as inline &lt;script&gt;</w:t>
+      </w:r>
+      <w:r>
+        <w:rPr>
+          <w:lang w:val="en-CA"/>
+        </w:rPr>
+        <w:t xml:space="preserve"> </w:t>
+      </w:r>
+      <w:r>
+        <w:rPr>
+          <w:lang w:val="en-CA"/>
+        </w:rPr>
+        <w:t xml:space="preserve">blocks at the bottom of </w:t>
+      </w:r>
+      <w:r>
+        <w:rPr>
+          <w:b/>
+          <w:bCs/>
+          <w:lang w:val="en-CA"/>
+        </w:rPr>
+        <w:t>“index.html”, “resume.html”</w:t>
+      </w:r>
+      <w:r>
+        <w:rPr>
+          <w:b/>
+          <w:bCs/>
+          <w:lang w:val="en-CA"/>
+        </w:rPr>
+        <w:t xml:space="preserve"> </w:t>
+      </w:r>
+      <w:r>
+        <w:rPr>
+          <w:lang w:val="en-CA"/>
+        </w:rPr>
+        <w:t xml:space="preserve">respectively. This separation keeps the shared code </w:t>
+      </w:r>
+      <w:proofErr w:type="spellStart"/>
+      <w:r>
+        <w:rPr>
+          <w:lang w:val="en-CA"/>
+        </w:rPr>
+        <w:t>ine</w:t>
+      </w:r>
+      <w:proofErr w:type="spellEnd"/>
+      <w:r>
+        <w:rPr>
+          <w:lang w:val="en-CA"/>
+        </w:rPr>
+        <w:t xml:space="preserve"> one maintainable place while keeping page-specific logic close to the HTML</w:t>
+      </w:r>
+      <w:r>
+        <w:rPr>
+          <w:lang w:val="en-CA"/>
+        </w:rPr>
+        <w:t xml:space="preserve"> it affects.</w:t>
+      </w:r>
+    </w:p>
     <w:sectPr>
       <w:pgSz w:w="12240" w:h="15840"/>
       <w:pgMar w:top="1440" w:right="1800" w:bottom="1440" w:left="1800" w:header="708" w:footer="708" w:gutter="0"/>
@@ -11,6 +289,195 @@
     </w:sectPr>
   </w:body>
 </w:document>
+</file>
+
+<file path=word/numbering.xml><?xml version="1.0" encoding="utf-8"?>
+<w:numbering xmlns:wpc="http://schemas.microsoft.com/office/word/2010/wordprocessingCanvas" xmlns:cx="http://schemas.microsoft.com/office/drawing/2014/chartex" xmlns:cx1="http://schemas.microsoft.com/office/drawing/2015/9/8/chartex" xmlns:cx2="http://schemas.microsoft.com/office/drawing/2015/10/21/chartex" xmlns:cx3="http://schemas.microsoft.com/office/drawing/2016/5/9/chartex" xmlns:cx4="http://schemas.microsoft.com/office/drawing/2016/5/10/chartex" xmlns:cx5="http://schemas.microsoft.com/office/drawing/2016/5/11/chartex" xmlns:cx6="http://schemas.microsoft.com/office/drawing/2016/5/12/chartex" xmlns:cx7="http://schemas.microsoft.com/office/drawing/2016/5/13/chartex" xmlns:cx8="http://schemas.microsoft.com/office/drawing/2016/5/14/chartex" xmlns:mc="http://schemas.openxmlformats.org/markup-compatibility/2006" xmlns:aink="http://schemas.microsoft.com/office/drawing/2016/ink" xmlns:am3d="http://schemas.microsoft.com/office/drawing/2017/model3d" xmlns:o="urn:schemas-microsoft-com:office:office" xmlns:oel="http://schemas.microsoft.com/office/2019/extlst" xmlns:r="http://schemas.openxmlformats.org/officeDocument/2006/relationships" xmlns:m="http://schemas.openxmlformats.org/officeDocument/2006/math" xmlns:v="urn:schemas-microsoft-com:vml" xmlns:wp14="http://schemas.microsoft.com/office/word/2010/wordprocessingDrawing" xmlns:wp="http://schemas.openxmlformats.org/drawingml/2006/wordprocessingDrawing" xmlns:w10="urn:schemas-microsoft-com:office:word" xmlns:w="http://schemas.openxmlformats.org/wordprocessingml/2006/main" xmlns:w14="http://schemas.microsoft.com/office/word/2010/wordml" xmlns:w15="http://schemas.microsoft.com/office/word/2012/wordml" xmlns:w16cex="http://schemas.microsoft.com/office/word/2018/wordml/cex" xmlns:w16cid="http://schemas.microsoft.com/office/word/2016/wordml/cid" xmlns:w16="http://schemas.microsoft.com/office/word/2018/wordml" xmlns:w16du="http://schemas.microsoft.com/office/word/2023/wordml/word16du" xmlns:w16sdtdh="http://schemas.microsoft.com/office/word/2020/wordml/sdtdatahash" xmlns:w16sdtfl="http://schemas.microsoft.com/office/word/2024/wordml/sdtformatlock" xmlns:w16se="http://schemas.microsoft.com/office/word/2015/wordml/symex" xmlns:wpg="http://schemas.microsoft.com/office/word/2010/wordprocessingGroup" xmlns:wpi="http://schemas.microsoft.com/office/word/2010/wordprocessingInk" xmlns:wne="http://schemas.microsoft.com/office/word/2006/wordml" xmlns:wps="http://schemas.microsoft.com/office/word/2010/wordprocessingShape" mc:Ignorable="w14 w15 w16se w16cid w16 w16cex w16sdtdh w16sdtfl w16du wp14">
+  <w:abstractNum w:abstractNumId="0" w15:restartNumberingAfterBreak="0">
+    <w:nsid w:val="29295488"/>
+    <w:multiLevelType w:val="hybridMultilevel"/>
+    <w:tmpl w:val="1020D89A"/>
+    <w:lvl w:ilvl="0" w:tplc="CA54A5A4">
+      <w:start w:val="1"/>
+      <w:numFmt w:val="upperLetter"/>
+      <w:lvlText w:val="%1-"/>
+      <w:lvlJc w:val="left"/>
+      <w:pPr>
+        <w:ind w:left="720" w:hanging="360"/>
+      </w:pPr>
+      <w:rPr>
+        <w:rFonts w:hint="default"/>
+      </w:rPr>
+    </w:lvl>
+    <w:lvl w:ilvl="1" w:tplc="0C0C0019" w:tentative="1">
+      <w:start w:val="1"/>
+      <w:numFmt w:val="lowerLetter"/>
+      <w:lvlText w:val="%2."/>
+      <w:lvlJc w:val="left"/>
+      <w:pPr>
+        <w:ind w:left="1440" w:hanging="360"/>
+      </w:pPr>
+    </w:lvl>
+    <w:lvl w:ilvl="2" w:tplc="0C0C001B" w:tentative="1">
+      <w:start w:val="1"/>
+      <w:numFmt w:val="lowerRoman"/>
+      <w:lvlText w:val="%3."/>
+      <w:lvlJc w:val="right"/>
+      <w:pPr>
+        <w:ind w:left="2160" w:hanging="180"/>
+      </w:pPr>
+    </w:lvl>
+    <w:lvl w:ilvl="3" w:tplc="0C0C000F" w:tentative="1">
+      <w:start w:val="1"/>
+      <w:numFmt w:val="decimal"/>
+      <w:lvlText w:val="%4."/>
+      <w:lvlJc w:val="left"/>
+      <w:pPr>
+        <w:ind w:left="2880" w:hanging="360"/>
+      </w:pPr>
+    </w:lvl>
+    <w:lvl w:ilvl="4" w:tplc="0C0C0019" w:tentative="1">
+      <w:start w:val="1"/>
+      <w:numFmt w:val="lowerLetter"/>
+      <w:lvlText w:val="%5."/>
+      <w:lvlJc w:val="left"/>
+      <w:pPr>
+        <w:ind w:left="3600" w:hanging="360"/>
+      </w:pPr>
+    </w:lvl>
+    <w:lvl w:ilvl="5" w:tplc="0C0C001B" w:tentative="1">
+      <w:start w:val="1"/>
+      <w:numFmt w:val="lowerRoman"/>
+      <w:lvlText w:val="%6."/>
+      <w:lvlJc w:val="right"/>
+      <w:pPr>
+        <w:ind w:left="4320" w:hanging="180"/>
+      </w:pPr>
+    </w:lvl>
+    <w:lvl w:ilvl="6" w:tplc="0C0C000F" w:tentative="1">
+      <w:start w:val="1"/>
+      <w:numFmt w:val="decimal"/>
+      <w:lvlText w:val="%7."/>
+      <w:lvlJc w:val="left"/>
+      <w:pPr>
+        <w:ind w:left="5040" w:hanging="360"/>
+      </w:pPr>
+    </w:lvl>
+    <w:lvl w:ilvl="7" w:tplc="0C0C0019" w:tentative="1">
+      <w:start w:val="1"/>
+      <w:numFmt w:val="lowerLetter"/>
+      <w:lvlText w:val="%8."/>
+      <w:lvlJc w:val="left"/>
+      <w:pPr>
+        <w:ind w:left="5760" w:hanging="360"/>
+      </w:pPr>
+    </w:lvl>
+    <w:lvl w:ilvl="8" w:tplc="0C0C001B" w:tentative="1">
+      <w:start w:val="1"/>
+      <w:numFmt w:val="lowerRoman"/>
+      <w:lvlText w:val="%9."/>
+      <w:lvlJc w:val="right"/>
+      <w:pPr>
+        <w:ind w:left="6480" w:hanging="180"/>
+      </w:pPr>
+    </w:lvl>
+  </w:abstractNum>
+  <w:abstractNum w:abstractNumId="1" w15:restartNumberingAfterBreak="0">
+    <w:nsid w:val="55DE76E1"/>
+    <w:multiLevelType w:val="hybridMultilevel"/>
+    <w:tmpl w:val="40709286"/>
+    <w:lvl w:ilvl="0" w:tplc="3DB49DB2">
+      <w:start w:val="1"/>
+      <w:numFmt w:val="decimal"/>
+      <w:lvlText w:val="%1-"/>
+      <w:lvlJc w:val="left"/>
+      <w:pPr>
+        <w:ind w:left="720" w:hanging="360"/>
+      </w:pPr>
+      <w:rPr>
+        <w:rFonts w:hint="default"/>
+      </w:rPr>
+    </w:lvl>
+    <w:lvl w:ilvl="1" w:tplc="0C0C0019" w:tentative="1">
+      <w:start w:val="1"/>
+      <w:numFmt w:val="lowerLetter"/>
+      <w:lvlText w:val="%2."/>
+      <w:lvlJc w:val="left"/>
+      <w:pPr>
+        <w:ind w:left="1440" w:hanging="360"/>
+      </w:pPr>
+    </w:lvl>
+    <w:lvl w:ilvl="2" w:tplc="0C0C001B" w:tentative="1">
+      <w:start w:val="1"/>
+      <w:numFmt w:val="lowerRoman"/>
+      <w:lvlText w:val="%3."/>
+      <w:lvlJc w:val="right"/>
+      <w:pPr>
+        <w:ind w:left="2160" w:hanging="180"/>
+      </w:pPr>
+    </w:lvl>
+    <w:lvl w:ilvl="3" w:tplc="0C0C000F" w:tentative="1">
+      <w:start w:val="1"/>
+      <w:numFmt w:val="decimal"/>
+      <w:lvlText w:val="%4."/>
+      <w:lvlJc w:val="left"/>
+      <w:pPr>
+        <w:ind w:left="2880" w:hanging="360"/>
+      </w:pPr>
+    </w:lvl>
+    <w:lvl w:ilvl="4" w:tplc="0C0C0019" w:tentative="1">
+      <w:start w:val="1"/>
+      <w:numFmt w:val="lowerLetter"/>
+      <w:lvlText w:val="%5."/>
+      <w:lvlJc w:val="left"/>
+      <w:pPr>
+        <w:ind w:left="3600" w:hanging="360"/>
+      </w:pPr>
+    </w:lvl>
+    <w:lvl w:ilvl="5" w:tplc="0C0C001B" w:tentative="1">
+      <w:start w:val="1"/>
+      <w:numFmt w:val="lowerRoman"/>
+      <w:lvlText w:val="%6."/>
+      <w:lvlJc w:val="right"/>
+      <w:pPr>
+        <w:ind w:left="4320" w:hanging="180"/>
+      </w:pPr>
+    </w:lvl>
+    <w:lvl w:ilvl="6" w:tplc="0C0C000F" w:tentative="1">
+      <w:start w:val="1"/>
+      <w:numFmt w:val="decimal"/>
+      <w:lvlText w:val="%7."/>
+      <w:lvlJc w:val="left"/>
+      <w:pPr>
+        <w:ind w:left="5040" w:hanging="360"/>
+      </w:pPr>
+    </w:lvl>
+    <w:lvl w:ilvl="7" w:tplc="0C0C0019" w:tentative="1">
+      <w:start w:val="1"/>
+      <w:numFmt w:val="lowerLetter"/>
+      <w:lvlText w:val="%8."/>
+      <w:lvlJc w:val="left"/>
+      <w:pPr>
+        <w:ind w:left="5760" w:hanging="360"/>
+      </w:pPr>
+    </w:lvl>
+    <w:lvl w:ilvl="8" w:tplc="0C0C001B" w:tentative="1">
+      <w:start w:val="1"/>
+      <w:numFmt w:val="lowerRoman"/>
+      <w:lvlText w:val="%9."/>
+      <w:lvlJc w:val="right"/>
+      <w:pPr>
+        <w:ind w:left="6480" w:hanging="180"/>
+      </w:pPr>
+    </w:lvl>
+  </w:abstractNum>
+  <w:num w:numId="1" w16cid:durableId="629018775">
+    <w:abstractNumId w:val="1"/>
+  </w:num>
+  <w:num w:numId="2" w16cid:durableId="19017656">
+    <w:abstractNumId w:val="0"/>
+  </w:num>
+</w:numbering>
 </file>
 
 <file path=word/styles.xml><?xml version="1.0" encoding="utf-8"?>

</xml_diff>